<commit_message>
Address live-app feedback in AppSheet handoff package
- Add Gender (required) and Age (optional) fields to Requests
- Add a 4th AccessRequests table for self-service access requests
  with admin approve/deny, honestly scoped to what AppSheet can and
  can't automate about actual app access
- Clarify Preferred Option applies identically to the POC bulk grid,
  not just the self-request form
- Explain the POC bulk request screen design plainly: same fields as
  the self form, one row per traveller in a grid, not a separate design
- Add a Mobile UI section root-causing the overlapping bottom-button
  issue to multiple prominent actions on one view, with the exact fix
</commit_message>
<xml_diff>
--- a/appsheet/AppSheet-Configuration-Checklist.docx
+++ b/appsheet/AppSheet-Configuration-Checklist.docx
@@ -39,7 +39,7 @@
         <w:spacing w:after="160" w:before="320"/>
       </w:pPr>
       <w:r>
-        <w:t xml:space="preserve">Before you start</w:t>
+        <w:t xml:space="preserve">What changed in this revision</w:t>
       </w:r>
     </w:p>
     <w:p>
@@ -57,7 +57,106 @@
           <w:sz w:val="20"/>
           <w:szCs w:val="20"/>
         </w:rPr>
-        <w:t xml:space="preserve">Data source is the Google Sheet "SSB Consecration — Travel &amp; Stay (AppSheet Data)" at https://docs.google.com/spreadsheets/d/1uOvX4ZPpzcdDgR1_0ni8h_tmPPCoW3mT1bc5LCpwQPc/edit — it already has 3 tabs with the exact header rows: Requests (empty, 29 columns), RecommendedTrains (3 example rows), RecommendedFlights (3 example rows).</w:t>
+        <w:t xml:space="preserve">Added **Gender** (required) and **Age** (optional) columns to Requests — see row 12–13 in the column table below. The live sheet you already built from needs these two columns added by hand (Sheet editor → Requests tab → insert 2 columns after Region) since there is no API to edit it from here; everything else in this doc already accounts for them.</w:t>
+      </w:r>
+    </w:p>
+    <w:p>
+      <w:pPr>
+        <w:pStyle w:val="ListParagraph"/>
+        <w:numPr>
+          <w:ilvl w:val="0"/>
+          <w:numId w:val="2"/>
+        </w:numPr>
+        <w:spacing w:after="100"/>
+      </w:pPr>
+      <w:r>
+        <w:rPr>
+          <w:rFonts w:ascii="Arial" w:cs="Arial" w:eastAsia="Arial" w:hAnsi="Arial"/>
+          <w:sz w:val="20"/>
+          <w:szCs w:val="20"/>
+        </w:rPr>
+        <w:t xml:space="preserve">Clarified: **Preferred Option is required for every Train/Flight traveller, including ones added through the POC bulk grid** — it is the same column with the same Show_If/Required_If rule in both the self form and the bulk grid. If it isn't showing up in the bulk view, it's almost certainly just missing from that view's column list (see Views #2 below) — add it back in, no new logic needed.</w:t>
+      </w:r>
+    </w:p>
+    <w:p>
+      <w:pPr>
+        <w:pStyle w:val="ListParagraph"/>
+        <w:numPr>
+          <w:ilvl w:val="0"/>
+          <w:numId w:val="2"/>
+        </w:numPr>
+        <w:spacing w:after="100"/>
+      </w:pPr>
+      <w:r>
+        <w:rPr>
+          <w:rFonts w:ascii="Arial" w:cs="Arial" w:eastAsia="Arial" w:hAnsi="Arial"/>
+          <w:sz w:val="20"/>
+          <w:szCs w:val="20"/>
+        </w:rPr>
+        <w:t xml:space="preserve">Expanded the "Raise Requests (POC bulk)" view description — see Views #2 — to directly answer "how does the bulk screen work": it is the exact same set of fields as the single self-request form, just entered one row per traveller in a spreadsheet-style grid, not a separate design.</w:t>
+      </w:r>
+    </w:p>
+    <w:p>
+      <w:pPr>
+        <w:pStyle w:val="ListParagraph"/>
+        <w:numPr>
+          <w:ilvl w:val="0"/>
+          <w:numId w:val="2"/>
+        </w:numPr>
+        <w:spacing w:after="100"/>
+      </w:pPr>
+      <w:r>
+        <w:rPr>
+          <w:rFonts w:ascii="Arial" w:cs="Arial" w:eastAsia="Arial" w:hAnsi="Arial"/>
+          <w:sz w:val="20"/>
+          <w:szCs w:val="20"/>
+        </w:rPr>
+        <w:t xml:space="preserve">Added a **Mobile UI** section addressing overlapping bottom buttons — this is almost always caused by more than one action being marked "prominent" on the same view.</w:t>
+      </w:r>
+    </w:p>
+    <w:p>
+      <w:pPr>
+        <w:pStyle w:val="ListParagraph"/>
+        <w:numPr>
+          <w:ilvl w:val="0"/>
+          <w:numId w:val="2"/>
+        </w:numPr>
+        <w:spacing w:after="100"/>
+      </w:pPr>
+      <w:r>
+        <w:rPr>
+          <w:rFonts w:ascii="Arial" w:cs="Arial" w:eastAsia="Arial" w:hAnsi="Arial"/>
+          <w:sz w:val="20"/>
+          <w:szCs w:val="20"/>
+        </w:rPr>
+        <w:t xml:space="preserve">Added a **Self-service access request + approval** section, so people needing access can request it in-app and either of you can approve — with an honest note on what AppSheet can and can't automate here.</w:t>
+      </w:r>
+    </w:p>
+    <w:p>
+      <w:pPr>
+        <w:pStyle w:val="Heading1"/>
+        <w:spacing w:after="160" w:before="320"/>
+      </w:pPr>
+      <w:r>
+        <w:t xml:space="preserve">Before you start</w:t>
+      </w:r>
+    </w:p>
+    <w:p>
+      <w:pPr>
+        <w:pStyle w:val="ListParagraph"/>
+        <w:numPr>
+          <w:ilvl w:val="0"/>
+          <w:numId w:val="2"/>
+        </w:numPr>
+        <w:spacing w:after="100"/>
+      </w:pPr>
+      <w:r>
+        <w:rPr>
+          <w:rFonts w:ascii="Arial" w:cs="Arial" w:eastAsia="Arial" w:hAnsi="Arial"/>
+          <w:sz w:val="20"/>
+          <w:szCs w:val="20"/>
+        </w:rPr>
+        <w:t xml:space="preserve">Data source is the Google Sheet "SSB Consecration — Travel &amp; Stay (AppSheet Data)" at https://docs.google.com/spreadsheets/d/1uOvX4ZPpzcdDgR1_0ni8h_tmPPCoW3mT1bc5LCpwQPc/edit — it already has 3 tabs with the exact header rows: Requests (31 columns after adding Gender/Age — see "What changed" above), RecommendedTrains (3 example rows), RecommendedFlights (3 example rows).</w:t>
       </w:r>
     </w:p>
     <w:p>
@@ -1541,7 +1640,7 @@
                 <w:sz w:val="20"/>
                 <w:szCs w:val="20"/>
               </w:rPr>
-              <w:t xml:space="preserve">Phone</w:t>
+              <w:t xml:space="preserve">Gender</w:t>
             </w:r>
           </w:p>
         </w:tc>
@@ -1562,185 +1661,7 @@
                 <w:sz w:val="20"/>
                 <w:szCs w:val="20"/>
               </w:rPr>
-              <w:t xml:space="preserve">Phone</w:t>
-            </w:r>
-          </w:p>
-        </w:tc>
-        <w:tc>
-          <w:tcPr>
-            <w:tcW w:type="dxa" w:w="5800"/>
-            <w:tcMar>
-              <w:top w:type="dxa" w:w="60"/>
-              <w:left w:type="dxa" w:w="100"/>
-              <w:bottom w:type="dxa" w:w="60"/>
-              <w:right w:type="dxa" w:w="100"/>
-            </w:tcMar>
-          </w:tcPr>
-          <w:p/>
-        </w:tc>
-        <w:tc>
-          <w:tcPr>
-            <w:tcW w:type="dxa" w:w="3300"/>
-            <w:tcMar>
-              <w:top w:type="dxa" w:w="60"/>
-              <w:left w:type="dxa" w:w="100"/>
-              <w:bottom w:type="dxa" w:w="60"/>
-              <w:right w:type="dxa" w:w="100"/>
-            </w:tcMar>
-          </w:tcPr>
-          <w:p/>
-        </w:tc>
-      </w:tr>
-      <w:tr>
-        <w:tc>
-          <w:tcPr>
-            <w:tcW w:type="dxa" w:w="500"/>
-            <w:tcMar>
-              <w:top w:type="dxa" w:w="60"/>
-              <w:left w:type="dxa" w:w="100"/>
-              <w:bottom w:type="dxa" w:w="60"/>
-              <w:right w:type="dxa" w:w="100"/>
-            </w:tcMar>
-          </w:tcPr>
-          <w:p>
-            <w:r>
-              <w:rPr>
-                <w:rFonts w:ascii="Arial" w:cs="Arial" w:eastAsia="Arial" w:hAnsi="Arial"/>
-                <w:sz w:val="20"/>
-                <w:szCs w:val="20"/>
-              </w:rPr>
-              <w:t xml:space="preserve">13</w:t>
-            </w:r>
-          </w:p>
-        </w:tc>
-        <w:tc>
-          <w:tcPr>
-            <w:tcW w:type="dxa" w:w="1600"/>
-            <w:tcMar>
-              <w:top w:type="dxa" w:w="60"/>
-              <w:left w:type="dxa" w:w="100"/>
-              <w:bottom w:type="dxa" w:w="60"/>
-              <w:right w:type="dxa" w:w="100"/>
-            </w:tcMar>
-          </w:tcPr>
-          <w:p>
-            <w:r>
-              <w:rPr>
-                <w:rFonts w:ascii="Arial" w:cs="Arial" w:eastAsia="Arial" w:hAnsi="Arial"/>
-                <w:sz w:val="20"/>
-                <w:szCs w:val="20"/>
-              </w:rPr>
-              <w:t xml:space="preserve">Email</w:t>
-            </w:r>
-          </w:p>
-        </w:tc>
-        <w:tc>
-          <w:tcPr>
-            <w:tcW w:type="dxa" w:w="3200"/>
-            <w:tcMar>
-              <w:top w:type="dxa" w:w="60"/>
-              <w:left w:type="dxa" w:w="100"/>
-              <w:bottom w:type="dxa" w:w="60"/>
-              <w:right w:type="dxa" w:w="100"/>
-            </w:tcMar>
-          </w:tcPr>
-          <w:p>
-            <w:r>
-              <w:rPr>
-                <w:rFonts w:ascii="Arial" w:cs="Arial" w:eastAsia="Arial" w:hAnsi="Arial"/>
-                <w:sz w:val="20"/>
-                <w:szCs w:val="20"/>
-              </w:rPr>
-              <w:t xml:space="preserve">Email</w:t>
-            </w:r>
-          </w:p>
-        </w:tc>
-        <w:tc>
-          <w:tcPr>
-            <w:tcW w:type="dxa" w:w="5800"/>
-            <w:tcMar>
-              <w:top w:type="dxa" w:w="60"/>
-              <w:left w:type="dxa" w:w="100"/>
-              <w:bottom w:type="dxa" w:w="60"/>
-              <w:right w:type="dxa" w:w="100"/>
-            </w:tcMar>
-          </w:tcPr>
-          <w:p/>
-        </w:tc>
-        <w:tc>
-          <w:tcPr>
-            <w:tcW w:type="dxa" w:w="3300"/>
-            <w:tcMar>
-              <w:top w:type="dxa" w:w="60"/>
-              <w:left w:type="dxa" w:w="100"/>
-              <w:bottom w:type="dxa" w:w="60"/>
-              <w:right w:type="dxa" w:w="100"/>
-            </w:tcMar>
-          </w:tcPr>
-          <w:p/>
-        </w:tc>
-      </w:tr>
-      <w:tr>
-        <w:tc>
-          <w:tcPr>
-            <w:tcW w:type="dxa" w:w="500"/>
-            <w:tcMar>
-              <w:top w:type="dxa" w:w="60"/>
-              <w:left w:type="dxa" w:w="100"/>
-              <w:bottom w:type="dxa" w:w="60"/>
-              <w:right w:type="dxa" w:w="100"/>
-            </w:tcMar>
-          </w:tcPr>
-          <w:p>
-            <w:r>
-              <w:rPr>
-                <w:rFonts w:ascii="Arial" w:cs="Arial" w:eastAsia="Arial" w:hAnsi="Arial"/>
-                <w:sz w:val="20"/>
-                <w:szCs w:val="20"/>
-              </w:rPr>
-              <w:t xml:space="preserve">14</w:t>
-            </w:r>
-          </w:p>
-        </w:tc>
-        <w:tc>
-          <w:tcPr>
-            <w:tcW w:type="dxa" w:w="1600"/>
-            <w:tcMar>
-              <w:top w:type="dxa" w:w="60"/>
-              <w:left w:type="dxa" w:w="100"/>
-              <w:bottom w:type="dxa" w:w="60"/>
-              <w:right w:type="dxa" w:w="100"/>
-            </w:tcMar>
-          </w:tcPr>
-          <w:p>
-            <w:r>
-              <w:rPr>
-                <w:rFonts w:ascii="Arial" w:cs="Arial" w:eastAsia="Arial" w:hAnsi="Arial"/>
-                <w:sz w:val="20"/>
-                <w:szCs w:val="20"/>
-              </w:rPr>
-              <w:t xml:space="preserve">Check-in</w:t>
-            </w:r>
-          </w:p>
-        </w:tc>
-        <w:tc>
-          <w:tcPr>
-            <w:tcW w:type="dxa" w:w="3200"/>
-            <w:tcMar>
-              <w:top w:type="dxa" w:w="60"/>
-              <w:left w:type="dxa" w:w="100"/>
-              <w:bottom w:type="dxa" w:w="60"/>
-              <w:right w:type="dxa" w:w="100"/>
-            </w:tcMar>
-          </w:tcPr>
-          <w:p>
-            <w:r>
-              <w:rPr>
-                <w:rFonts w:ascii="Arial" w:cs="Arial" w:eastAsia="Arial" w:hAnsi="Arial"/>
-                <w:sz w:val="20"/>
-                <w:szCs w:val="20"/>
-              </w:rPr>
-              <w:t xml:space="preserve">Date</w:t>
+              <w:t xml:space="preserve">Enum (Male, Female, Other)</w:t>
             </w:r>
           </w:p>
         </w:tc>
@@ -1778,7 +1699,16 @@
               <w:right w:type="dxa" w:w="100"/>
             </w:tcMar>
           </w:tcPr>
-          <w:p/>
+          <w:p>
+            <w:r>
+              <w:rPr>
+                <w:rFonts w:ascii="Arial" w:cs="Arial" w:eastAsia="Arial" w:hAnsi="Arial"/>
+                <w:sz w:val="20"/>
+                <w:szCs w:val="20"/>
+              </w:rPr>
+              <w:t xml:space="preserve">NEW — needed by the Accommodation desk for dorm/bunk assignment.</w:t>
+            </w:r>
+          </w:p>
         </w:tc>
       </w:tr>
       <w:tr>
@@ -1799,7 +1729,7 @@
                 <w:sz w:val="20"/>
                 <w:szCs w:val="20"/>
               </w:rPr>
-              <w:t xml:space="preserve">15</w:t>
+              <w:t xml:space="preserve">13</w:t>
             </w:r>
           </w:p>
         </w:tc>
@@ -1820,7 +1750,7 @@
                 <w:sz w:val="20"/>
                 <w:szCs w:val="20"/>
               </w:rPr>
-              <w:t xml:space="preserve">Check-out</w:t>
+              <w:t xml:space="preserve">Age</w:t>
             </w:r>
           </w:p>
         </w:tc>
@@ -1841,7 +1771,7 @@
                 <w:sz w:val="20"/>
                 <w:szCs w:val="20"/>
               </w:rPr>
-              <w:t xml:space="preserve">Date</w:t>
+              <w:t xml:space="preserve">Number</w:t>
             </w:r>
           </w:p>
         </w:tc>
@@ -1865,9 +1795,292 @@
                 <w:sz w:val="20"/>
                 <w:szCs w:val="20"/>
               </w:rPr>
-              <w:t xml:space="preserve">Required: Yes</w:t>
-            </w:r>
-          </w:p>
+              <w:t xml:space="preserve">Valid_If: </w:t>
+            </w:r>
+            <w:r>
+              <w:rPr>
+                <w:rFonts w:ascii="Consolas" w:cs="Consolas" w:eastAsia="Consolas" w:hAnsi="Consolas"/>
+                <w:sz w:val="19"/>
+                <w:szCs w:val="19"/>
+              </w:rPr>
+              <w:t xml:space="preserve">=AND([Age] &gt;= 0, [Age] &lt;= 120)</w:t>
+            </w:r>
+          </w:p>
+        </w:tc>
+        <w:tc>
+          <w:tcPr>
+            <w:tcW w:type="dxa" w:w="3300"/>
+            <w:tcMar>
+              <w:top w:type="dxa" w:w="60"/>
+              <w:left w:type="dxa" w:w="100"/>
+              <w:bottom w:type="dxa" w:w="60"/>
+              <w:right w:type="dxa" w:w="100"/>
+            </w:tcMar>
+          </w:tcPr>
+          <w:p>
+            <w:r>
+              <w:rPr>
+                <w:rFonts w:ascii="Arial" w:cs="Arial" w:eastAsia="Arial" w:hAnsi="Arial"/>
+                <w:sz w:val="20"/>
+                <w:szCs w:val="20"/>
+              </w:rPr>
+              <w:t xml:space="preserve">NEW — optional. Valid_If error message: "Enter a valid age."</w:t>
+            </w:r>
+          </w:p>
+        </w:tc>
+      </w:tr>
+      <w:tr>
+        <w:tc>
+          <w:tcPr>
+            <w:tcW w:type="dxa" w:w="500"/>
+            <w:tcMar>
+              <w:top w:type="dxa" w:w="60"/>
+              <w:left w:type="dxa" w:w="100"/>
+              <w:bottom w:type="dxa" w:w="60"/>
+              <w:right w:type="dxa" w:w="100"/>
+            </w:tcMar>
+          </w:tcPr>
+          <w:p>
+            <w:r>
+              <w:rPr>
+                <w:rFonts w:ascii="Arial" w:cs="Arial" w:eastAsia="Arial" w:hAnsi="Arial"/>
+                <w:sz w:val="20"/>
+                <w:szCs w:val="20"/>
+              </w:rPr>
+              <w:t xml:space="preserve">14</w:t>
+            </w:r>
+          </w:p>
+        </w:tc>
+        <w:tc>
+          <w:tcPr>
+            <w:tcW w:type="dxa" w:w="1600"/>
+            <w:tcMar>
+              <w:top w:type="dxa" w:w="60"/>
+              <w:left w:type="dxa" w:w="100"/>
+              <w:bottom w:type="dxa" w:w="60"/>
+              <w:right w:type="dxa" w:w="100"/>
+            </w:tcMar>
+          </w:tcPr>
+          <w:p>
+            <w:r>
+              <w:rPr>
+                <w:rFonts w:ascii="Arial" w:cs="Arial" w:eastAsia="Arial" w:hAnsi="Arial"/>
+                <w:sz w:val="20"/>
+                <w:szCs w:val="20"/>
+              </w:rPr>
+              <w:t xml:space="preserve">Phone</w:t>
+            </w:r>
+          </w:p>
+        </w:tc>
+        <w:tc>
+          <w:tcPr>
+            <w:tcW w:type="dxa" w:w="3200"/>
+            <w:tcMar>
+              <w:top w:type="dxa" w:w="60"/>
+              <w:left w:type="dxa" w:w="100"/>
+              <w:bottom w:type="dxa" w:w="60"/>
+              <w:right w:type="dxa" w:w="100"/>
+            </w:tcMar>
+          </w:tcPr>
+          <w:p>
+            <w:r>
+              <w:rPr>
+                <w:rFonts w:ascii="Arial" w:cs="Arial" w:eastAsia="Arial" w:hAnsi="Arial"/>
+                <w:sz w:val="20"/>
+                <w:szCs w:val="20"/>
+              </w:rPr>
+              <w:t xml:space="preserve">Phone</w:t>
+            </w:r>
+          </w:p>
+        </w:tc>
+        <w:tc>
+          <w:tcPr>
+            <w:tcW w:type="dxa" w:w="5800"/>
+            <w:tcMar>
+              <w:top w:type="dxa" w:w="60"/>
+              <w:left w:type="dxa" w:w="100"/>
+              <w:bottom w:type="dxa" w:w="60"/>
+              <w:right w:type="dxa" w:w="100"/>
+            </w:tcMar>
+          </w:tcPr>
+          <w:p/>
+        </w:tc>
+        <w:tc>
+          <w:tcPr>
+            <w:tcW w:type="dxa" w:w="3300"/>
+            <w:tcMar>
+              <w:top w:type="dxa" w:w="60"/>
+              <w:left w:type="dxa" w:w="100"/>
+              <w:bottom w:type="dxa" w:w="60"/>
+              <w:right w:type="dxa" w:w="100"/>
+            </w:tcMar>
+          </w:tcPr>
+          <w:p/>
+        </w:tc>
+      </w:tr>
+      <w:tr>
+        <w:tc>
+          <w:tcPr>
+            <w:tcW w:type="dxa" w:w="500"/>
+            <w:tcMar>
+              <w:top w:type="dxa" w:w="60"/>
+              <w:left w:type="dxa" w:w="100"/>
+              <w:bottom w:type="dxa" w:w="60"/>
+              <w:right w:type="dxa" w:w="100"/>
+            </w:tcMar>
+          </w:tcPr>
+          <w:p>
+            <w:r>
+              <w:rPr>
+                <w:rFonts w:ascii="Arial" w:cs="Arial" w:eastAsia="Arial" w:hAnsi="Arial"/>
+                <w:sz w:val="20"/>
+                <w:szCs w:val="20"/>
+              </w:rPr>
+              <w:t xml:space="preserve">15</w:t>
+            </w:r>
+          </w:p>
+        </w:tc>
+        <w:tc>
+          <w:tcPr>
+            <w:tcW w:type="dxa" w:w="1600"/>
+            <w:tcMar>
+              <w:top w:type="dxa" w:w="60"/>
+              <w:left w:type="dxa" w:w="100"/>
+              <w:bottom w:type="dxa" w:w="60"/>
+              <w:right w:type="dxa" w:w="100"/>
+            </w:tcMar>
+          </w:tcPr>
+          <w:p>
+            <w:r>
+              <w:rPr>
+                <w:rFonts w:ascii="Arial" w:cs="Arial" w:eastAsia="Arial" w:hAnsi="Arial"/>
+                <w:sz w:val="20"/>
+                <w:szCs w:val="20"/>
+              </w:rPr>
+              <w:t xml:space="preserve">Email</w:t>
+            </w:r>
+          </w:p>
+        </w:tc>
+        <w:tc>
+          <w:tcPr>
+            <w:tcW w:type="dxa" w:w="3200"/>
+            <w:tcMar>
+              <w:top w:type="dxa" w:w="60"/>
+              <w:left w:type="dxa" w:w="100"/>
+              <w:bottom w:type="dxa" w:w="60"/>
+              <w:right w:type="dxa" w:w="100"/>
+            </w:tcMar>
+          </w:tcPr>
+          <w:p>
+            <w:r>
+              <w:rPr>
+                <w:rFonts w:ascii="Arial" w:cs="Arial" w:eastAsia="Arial" w:hAnsi="Arial"/>
+                <w:sz w:val="20"/>
+                <w:szCs w:val="20"/>
+              </w:rPr>
+              <w:t xml:space="preserve">Email</w:t>
+            </w:r>
+          </w:p>
+        </w:tc>
+        <w:tc>
+          <w:tcPr>
+            <w:tcW w:type="dxa" w:w="5800"/>
+            <w:tcMar>
+              <w:top w:type="dxa" w:w="60"/>
+              <w:left w:type="dxa" w:w="100"/>
+              <w:bottom w:type="dxa" w:w="60"/>
+              <w:right w:type="dxa" w:w="100"/>
+            </w:tcMar>
+          </w:tcPr>
+          <w:p/>
+        </w:tc>
+        <w:tc>
+          <w:tcPr>
+            <w:tcW w:type="dxa" w:w="3300"/>
+            <w:tcMar>
+              <w:top w:type="dxa" w:w="60"/>
+              <w:left w:type="dxa" w:w="100"/>
+              <w:bottom w:type="dxa" w:w="60"/>
+              <w:right w:type="dxa" w:w="100"/>
+            </w:tcMar>
+          </w:tcPr>
+          <w:p/>
+        </w:tc>
+      </w:tr>
+      <w:tr>
+        <w:tc>
+          <w:tcPr>
+            <w:tcW w:type="dxa" w:w="500"/>
+            <w:tcMar>
+              <w:top w:type="dxa" w:w="60"/>
+              <w:left w:type="dxa" w:w="100"/>
+              <w:bottom w:type="dxa" w:w="60"/>
+              <w:right w:type="dxa" w:w="100"/>
+            </w:tcMar>
+          </w:tcPr>
+          <w:p>
+            <w:r>
+              <w:rPr>
+                <w:rFonts w:ascii="Arial" w:cs="Arial" w:eastAsia="Arial" w:hAnsi="Arial"/>
+                <w:sz w:val="20"/>
+                <w:szCs w:val="20"/>
+              </w:rPr>
+              <w:t xml:space="preserve">16</w:t>
+            </w:r>
+          </w:p>
+        </w:tc>
+        <w:tc>
+          <w:tcPr>
+            <w:tcW w:type="dxa" w:w="1600"/>
+            <w:tcMar>
+              <w:top w:type="dxa" w:w="60"/>
+              <w:left w:type="dxa" w:w="100"/>
+              <w:bottom w:type="dxa" w:w="60"/>
+              <w:right w:type="dxa" w:w="100"/>
+            </w:tcMar>
+          </w:tcPr>
+          <w:p>
+            <w:r>
+              <w:rPr>
+                <w:rFonts w:ascii="Arial" w:cs="Arial" w:eastAsia="Arial" w:hAnsi="Arial"/>
+                <w:sz w:val="20"/>
+                <w:szCs w:val="20"/>
+              </w:rPr>
+              <w:t xml:space="preserve">Check-in</w:t>
+            </w:r>
+          </w:p>
+        </w:tc>
+        <w:tc>
+          <w:tcPr>
+            <w:tcW w:type="dxa" w:w="3200"/>
+            <w:tcMar>
+              <w:top w:type="dxa" w:w="60"/>
+              <w:left w:type="dxa" w:w="100"/>
+              <w:bottom w:type="dxa" w:w="60"/>
+              <w:right w:type="dxa" w:w="100"/>
+            </w:tcMar>
+          </w:tcPr>
+          <w:p>
+            <w:r>
+              <w:rPr>
+                <w:rFonts w:ascii="Arial" w:cs="Arial" w:eastAsia="Arial" w:hAnsi="Arial"/>
+                <w:sz w:val="20"/>
+                <w:szCs w:val="20"/>
+              </w:rPr>
+              <w:t xml:space="preserve">Date</w:t>
+            </w:r>
+          </w:p>
+        </w:tc>
+        <w:tc>
+          <w:tcPr>
+            <w:tcW w:type="dxa" w:w="5800"/>
+            <w:tcMar>
+              <w:top w:type="dxa" w:w="60"/>
+              <w:left w:type="dxa" w:w="100"/>
+              <w:bottom w:type="dxa" w:w="60"/>
+              <w:right w:type="dxa" w:w="100"/>
+            </w:tcMar>
+          </w:tcPr>
           <w:p>
             <w:pPr>
               <w:spacing w:after="60"/>
@@ -1878,6 +2091,120 @@
                 <w:sz w:val="20"/>
                 <w:szCs w:val="20"/>
               </w:rPr>
+              <w:t xml:space="preserve">Required: Yes</w:t>
+            </w:r>
+          </w:p>
+        </w:tc>
+        <w:tc>
+          <w:tcPr>
+            <w:tcW w:type="dxa" w:w="3300"/>
+            <w:tcMar>
+              <w:top w:type="dxa" w:w="60"/>
+              <w:left w:type="dxa" w:w="100"/>
+              <w:bottom w:type="dxa" w:w="60"/>
+              <w:right w:type="dxa" w:w="100"/>
+            </w:tcMar>
+          </w:tcPr>
+          <w:p/>
+        </w:tc>
+      </w:tr>
+      <w:tr>
+        <w:tc>
+          <w:tcPr>
+            <w:tcW w:type="dxa" w:w="500"/>
+            <w:tcMar>
+              <w:top w:type="dxa" w:w="60"/>
+              <w:left w:type="dxa" w:w="100"/>
+              <w:bottom w:type="dxa" w:w="60"/>
+              <w:right w:type="dxa" w:w="100"/>
+            </w:tcMar>
+          </w:tcPr>
+          <w:p>
+            <w:r>
+              <w:rPr>
+                <w:rFonts w:ascii="Arial" w:cs="Arial" w:eastAsia="Arial" w:hAnsi="Arial"/>
+                <w:sz w:val="20"/>
+                <w:szCs w:val="20"/>
+              </w:rPr>
+              <w:t xml:space="preserve">17</w:t>
+            </w:r>
+          </w:p>
+        </w:tc>
+        <w:tc>
+          <w:tcPr>
+            <w:tcW w:type="dxa" w:w="1600"/>
+            <w:tcMar>
+              <w:top w:type="dxa" w:w="60"/>
+              <w:left w:type="dxa" w:w="100"/>
+              <w:bottom w:type="dxa" w:w="60"/>
+              <w:right w:type="dxa" w:w="100"/>
+            </w:tcMar>
+          </w:tcPr>
+          <w:p>
+            <w:r>
+              <w:rPr>
+                <w:rFonts w:ascii="Arial" w:cs="Arial" w:eastAsia="Arial" w:hAnsi="Arial"/>
+                <w:sz w:val="20"/>
+                <w:szCs w:val="20"/>
+              </w:rPr>
+              <w:t xml:space="preserve">Check-out</w:t>
+            </w:r>
+          </w:p>
+        </w:tc>
+        <w:tc>
+          <w:tcPr>
+            <w:tcW w:type="dxa" w:w="3200"/>
+            <w:tcMar>
+              <w:top w:type="dxa" w:w="60"/>
+              <w:left w:type="dxa" w:w="100"/>
+              <w:bottom w:type="dxa" w:w="60"/>
+              <w:right w:type="dxa" w:w="100"/>
+            </w:tcMar>
+          </w:tcPr>
+          <w:p>
+            <w:r>
+              <w:rPr>
+                <w:rFonts w:ascii="Arial" w:cs="Arial" w:eastAsia="Arial" w:hAnsi="Arial"/>
+                <w:sz w:val="20"/>
+                <w:szCs w:val="20"/>
+              </w:rPr>
+              <w:t xml:space="preserve">Date</w:t>
+            </w:r>
+          </w:p>
+        </w:tc>
+        <w:tc>
+          <w:tcPr>
+            <w:tcW w:type="dxa" w:w="5800"/>
+            <w:tcMar>
+              <w:top w:type="dxa" w:w="60"/>
+              <w:left w:type="dxa" w:w="100"/>
+              <w:bottom w:type="dxa" w:w="60"/>
+              <w:right w:type="dxa" w:w="100"/>
+            </w:tcMar>
+          </w:tcPr>
+          <w:p>
+            <w:pPr>
+              <w:spacing w:after="60"/>
+            </w:pPr>
+            <w:r>
+              <w:rPr>
+                <w:rFonts w:ascii="Arial" w:cs="Arial" w:eastAsia="Arial" w:hAnsi="Arial"/>
+                <w:sz w:val="20"/>
+                <w:szCs w:val="20"/>
+              </w:rPr>
+              <w:t xml:space="preserve">Required: Yes</w:t>
+            </w:r>
+          </w:p>
+          <w:p>
+            <w:pPr>
+              <w:spacing w:after="60"/>
+            </w:pPr>
+            <w:r>
+              <w:rPr>
+                <w:rFonts w:ascii="Arial" w:cs="Arial" w:eastAsia="Arial" w:hAnsi="Arial"/>
+                <w:sz w:val="20"/>
+                <w:szCs w:val="20"/>
+              </w:rPr>
               <w:t xml:space="preserve">Valid_If (recommended): </w:t>
             </w:r>
             <w:r>
@@ -1930,7 +2257,7 @@
                 <w:sz w:val="20"/>
                 <w:szCs w:val="20"/>
               </w:rPr>
-              <w:t xml:space="preserve">16</w:t>
+              <w:t xml:space="preserve">18</w:t>
             </w:r>
           </w:p>
         </w:tc>
@@ -2031,7 +2358,7 @@
                 <w:sz w:val="20"/>
                 <w:szCs w:val="20"/>
               </w:rPr>
-              <w:t xml:space="preserve">17</w:t>
+              <w:t xml:space="preserve">19</w:t>
             </w:r>
           </w:p>
         </w:tc>
@@ -2191,7 +2518,7 @@
                 <w:sz w:val="20"/>
                 <w:szCs w:val="20"/>
               </w:rPr>
-              <w:t xml:space="preserve">18</w:t>
+              <w:t xml:space="preserve">20</w:t>
             </w:r>
           </w:p>
         </w:tc>
@@ -2342,7 +2669,7 @@
                 <w:sz w:val="20"/>
                 <w:szCs w:val="20"/>
               </w:rPr>
-              <w:t xml:space="preserve">19</w:t>
+              <w:t xml:space="preserve">21</w:t>
             </w:r>
           </w:p>
         </w:tc>
@@ -2451,7 +2778,16 @@
               <w:right w:type="dxa" w:w="100"/>
             </w:tcMar>
           </w:tcPr>
-          <w:p/>
+          <w:p>
+            <w:r>
+              <w:rPr>
+                <w:rFonts w:ascii="Arial" w:cs="Arial" w:eastAsia="Arial" w:hAnsi="Arial"/>
+                <w:sz w:val="20"/>
+                <w:szCs w:val="20"/>
+              </w:rPr>
+              <w:t xml:space="preserve">REQUIRED for every Train/Flight traveller — including POC bulk rows. Same column, same rule, in both the self form and the POC grid (see "Views to create" #1 and #2): there is no separate config needed for the bulk case.</w:t>
+            </w:r>
+          </w:p>
         </w:tc>
       </w:tr>
       <w:tr>
@@ -2472,7 +2808,7 @@
                 <w:sz w:val="20"/>
                 <w:szCs w:val="20"/>
               </w:rPr>
-              <w:t xml:space="preserve">20</w:t>
+              <w:t xml:space="preserve">22</w:t>
             </w:r>
           </w:p>
         </w:tc>
@@ -2570,7 +2906,7 @@
                 <w:sz w:val="20"/>
                 <w:szCs w:val="20"/>
               </w:rPr>
-              <w:t xml:space="preserve">21</w:t>
+              <w:t xml:space="preserve">23</w:t>
             </w:r>
           </w:p>
         </w:tc>
@@ -2679,7 +3015,7 @@
                 <w:sz w:val="20"/>
                 <w:szCs w:val="20"/>
               </w:rPr>
-              <w:t xml:space="preserve">22</w:t>
+              <w:t xml:space="preserve">24</w:t>
             </w:r>
           </w:p>
         </w:tc>
@@ -2768,7 +3104,7 @@
                 <w:sz w:val="20"/>
                 <w:szCs w:val="20"/>
               </w:rPr>
-              <w:t xml:space="preserve">23</w:t>
+              <w:t xml:space="preserve">25</w:t>
             </w:r>
           </w:p>
         </w:tc>
@@ -2886,7 +3222,7 @@
                 <w:sz w:val="20"/>
                 <w:szCs w:val="20"/>
               </w:rPr>
-              <w:t xml:space="preserve">24</w:t>
+              <w:t xml:space="preserve">26</w:t>
             </w:r>
           </w:p>
         </w:tc>
@@ -2975,7 +3311,7 @@
                 <w:sz w:val="20"/>
                 <w:szCs w:val="20"/>
               </w:rPr>
-              <w:t xml:space="preserve">25</w:t>
+              <w:t xml:space="preserve">27</w:t>
             </w:r>
           </w:p>
         </w:tc>
@@ -3093,7 +3429,7 @@
                 <w:sz w:val="20"/>
                 <w:szCs w:val="20"/>
               </w:rPr>
-              <w:t xml:space="preserve">26</w:t>
+              <w:t xml:space="preserve">28</w:t>
             </w:r>
           </w:p>
         </w:tc>
@@ -3211,7 +3547,7 @@
                 <w:sz w:val="20"/>
                 <w:szCs w:val="20"/>
               </w:rPr>
-              <w:t xml:space="preserve">27</w:t>
+              <w:t xml:space="preserve">29</w:t>
             </w:r>
           </w:p>
         </w:tc>
@@ -3309,7 +3645,7 @@
                 <w:sz w:val="20"/>
                 <w:szCs w:val="20"/>
               </w:rPr>
-              <w:t xml:space="preserve">28</w:t>
+              <w:t xml:space="preserve">30</w:t>
             </w:r>
           </w:p>
         </w:tc>
@@ -3418,7 +3754,7 @@
                 <w:sz w:val="20"/>
                 <w:szCs w:val="20"/>
               </w:rPr>
-              <w:t xml:space="preserve">29</w:t>
+              <w:t xml:space="preserve">31</w:t>
             </w:r>
           </w:p>
         </w:tc>
@@ -3955,7 +4291,7 @@
           <w:sz w:val="20"/>
           <w:szCs w:val="20"/>
         </w:rPr>
-        <w:t xml:space="preserve">**Raise Request (Self)** — Form view, table Requests, Add-only. Column order: Requester Type, Name, Region, Phone, Email, Check-in, Check-out, Travel Mode, From, To, Preferred Option, Arrival, Last-mile to SSB, ID Type, ID Number, ID Image. (POC-only columns stay in the table’s column list but simply won’t display here since Requester Type won’t be POC on this form.)</w:t>
+        <w:t xml:space="preserve">**Raise Request (Self)** — Form view, table Requests, Add-only. Column order: Requester Type, Name, Gender, Age, Region, Phone, Email, Check-in, Check-out, Travel Mode, From, To, Preferred Option, Arrival, Last-mile to SSB, ID Type, ID Number, ID Image. (POC-only columns stay in the table’s column list but simply won’t display here since Requester Type won’t be POC on this form.)</w:t>
       </w:r>
     </w:p>
     <w:p>
@@ -3973,7 +4309,7 @@
           <w:sz w:val="20"/>
           <w:szCs w:val="20"/>
         </w:rPr>
-        <w:t xml:space="preserve">**Raise Requests (POC bulk)** — Table (grid) view, table Requests, inline Add/Edit enabled. Each traveller is added as a separate row with Requester Type set to POC on each — the POC-specific fields (POC Name/Team/Phone/Email, Traveller Type) then appear per row. This is the closest native AppSheet equivalent to a bulk multi-row entry table — it’s a grid of separately-added rows rather than one form with an embedded table, a real UX difference worth knowing about going in.</w:t>
+        <w:t xml:space="preserve">**Raise Requests (POC bulk) — how this screen actually works**: it is NOT a different design from the self-request form — it is the identical set of per-traveller fields (Name, Gender, Age, Region, Phone, Email, Travel Mode, From, To, Preferred Option, Arrival, Last-mile to SSB, Check-in, Check-out), just collected one row per traveller in a spreadsheet-style grid instead of one row per screen. Concretely: use a Table (grid) view, table Requests, with inline Add/Edit turned on. The POC adds a new row for each traveller and fills in that same field list across the row; Requester Type is set to POC on every row (either by the POC picking it each time, or — cleaner — pre-set it as this view's "Fixed value" for new rows so the POC never has to touch it). The POC-specific fields (POC Name/Team/Phone/Email, Traveller Type) appear as extra columns in the same row. Set the grid's column order to put Name, Gender, Age, Travel Mode, Preferred Option, Last-mile to SSB first (the fields that most often need attention) so they're visible without horizontal scrolling on a laptop-width screen; Preferred Option must be included in this view's column list like any other — it's governed by the exact same Show_If/Required_If rule as the self form (see row 21 in the column table above), so leaving it out is a view-configuration oversight, not a missing feature.</w:t>
       </w:r>
     </w:p>
     <w:p>
@@ -4284,6 +4620,118 @@
         <w:spacing w:after="160" w:before="320"/>
       </w:pPr>
       <w:r>
+        <w:t xml:space="preserve">Mobile UI — fixing overlapping bottom buttons</w:t>
+      </w:r>
+    </w:p>
+    <w:p>
+      <w:pPr>
+        <w:spacing w:after="140"/>
+      </w:pPr>
+      <w:r>
+        <w:rPr>
+          <w:rFonts w:ascii="Arial" w:cs="Arial" w:eastAsia="Arial" w:hAnsi="Arial"/>
+          <w:sz w:val="20"/>
+          <w:szCs w:val="20"/>
+        </w:rPr>
+        <w:t xml:space="preserve">Root cause: AppSheet renders one floating round action button per view for whichever action is marked "prominent." If two or more actions on the same view are both marked prominent, they stack in the same bottom-corner spot and overlap on narrow (mobile) screens. This is almost always the actual bug behind "bottom buttons are overlapping."</w:t>
+      </w:r>
+    </w:p>
+    <w:p>
+      <w:pPr>
+        <w:pStyle w:val="ListParagraph"/>
+        <w:numPr>
+          <w:ilvl w:val="0"/>
+          <w:numId w:val="4"/>
+        </w:numPr>
+        <w:spacing w:after="100"/>
+      </w:pPr>
+      <w:r>
+        <w:rPr>
+          <w:rFonts w:ascii="Arial" w:cs="Arial" w:eastAsia="Arial" w:hAnsi="Arial"/>
+          <w:sz w:val="20"/>
+          <w:szCs w:val="20"/>
+        </w:rPr>
+        <w:t xml:space="preserve">In the AppSheet editor, go to each view in turn (Coordinator Queue, Accommodation Desk, Travel Desk, Confirmation, Traveller ID Upload) and open Behavior → Actions for that view.</w:t>
+      </w:r>
+    </w:p>
+    <w:p>
+      <w:pPr>
+        <w:pStyle w:val="ListParagraph"/>
+        <w:numPr>
+          <w:ilvl w:val="0"/>
+          <w:numId w:val="4"/>
+        </w:numPr>
+        <w:spacing w:after="100"/>
+      </w:pPr>
+      <w:r>
+        <w:rPr>
+          <w:rFonts w:ascii="Arial" w:cs="Arial" w:eastAsia="Arial" w:hAnsi="Arial"/>
+          <w:sz w:val="20"/>
+          <w:szCs w:val="20"/>
+        </w:rPr>
+        <w:t xml:space="preserve">For every action listed, check its **Prominence** setting. Only ONE action per view should be set to "Display prominently" — the single primary action for that view (e.g. Allocate Stay on Accommodation Desk, Book Travel on Travel Desk). Set every other action on that same view (including any leftover default Add/Edit action, Copy traveller link, View confirmation) to "Display normally" or fold it into the row's "..." overflow menu instead.</w:t>
+      </w:r>
+    </w:p>
+    <w:p>
+      <w:pPr>
+        <w:pStyle w:val="ListParagraph"/>
+        <w:numPr>
+          <w:ilvl w:val="0"/>
+          <w:numId w:val="4"/>
+        </w:numPr>
+        <w:spacing w:after="100"/>
+      </w:pPr>
+      <w:r>
+        <w:rPr>
+          <w:rFonts w:ascii="Arial" w:cs="Arial" w:eastAsia="Arial" w:hAnsi="Arial"/>
+          <w:sz w:val="20"/>
+          <w:szCs w:val="20"/>
+        </w:rPr>
+        <w:t xml:space="preserve">Turn off the automatic "+" Add button on views that shouldn't create new rows directly — Confirmation and Traveller ID Upload are reached via a deep link to a specific row, not by adding a new one, so their view settings → "Show new" (or equivalent "allow adding") should be off.</w:t>
+      </w:r>
+    </w:p>
+    <w:p>
+      <w:pPr>
+        <w:pStyle w:val="ListParagraph"/>
+        <w:numPr>
+          <w:ilvl w:val="0"/>
+          <w:numId w:val="4"/>
+        </w:numPr>
+        <w:spacing w:after="100"/>
+      </w:pPr>
+      <w:r>
+        <w:rPr>
+          <w:rFonts w:ascii="Arial" w:cs="Arial" w:eastAsia="Arial" w:hAnsi="Arial"/>
+          <w:sz w:val="20"/>
+          <w:szCs w:val="20"/>
+        </w:rPr>
+        <w:t xml:space="preserve">Reduce Bottom Navigation crowding: under UX → Views, only mark 4–5 views as "Show in navigation" — Raise Request, Raise Requests (POC bulk), Coordinator Queue, Accommodation Desk, Travel Desk. Less-common views (Confirmation, Traveller ID Upload, Access Requests admin view below) should NOT be bottom-nav icons — they're reached via row actions or deep links, not by tapping the bar.</w:t>
+      </w:r>
+    </w:p>
+    <w:p>
+      <w:pPr>
+        <w:pStyle w:val="ListParagraph"/>
+        <w:numPr>
+          <w:ilvl w:val="0"/>
+          <w:numId w:val="4"/>
+        </w:numPr>
+        <w:spacing w:after="100"/>
+      </w:pPr>
+      <w:r>
+        <w:rPr>
+          <w:rFonts w:ascii="Arial" w:cs="Arial" w:eastAsia="Arial" w:hAnsi="Arial"/>
+          <w:sz w:val="20"/>
+          <w:szCs w:val="20"/>
+        </w:rPr>
+        <w:t xml:space="preserve">After each change, use the AppSheet editor's built-in phone preview (the phone icon, top of the editor) to confirm no two buttons render in the same corner before moving to the next view.</w:t>
+      </w:r>
+    </w:p>
+    <w:p>
+      <w:pPr>
+        <w:pStyle w:val="Heading1"/>
+        <w:spacing w:after="160" w:before="320"/>
+      </w:pPr>
+      <w:r>
         <w:t xml:space="preserve">Privacy / access restriction</w:t>
       </w:r>
     </w:p>
@@ -4424,7 +4872,33 @@
         <w:spacing w:after="160" w:before="320"/>
       </w:pPr>
       <w:r>
-        <w:t xml:space="preserve">Deviations from the original blueprint / prototype — read before you start</w:t>
+        <w:t xml:space="preserve">Self-service access request + approval</w:t>
+      </w:r>
+    </w:p>
+    <w:p>
+      <w:pPr>
+        <w:spacing w:after="140"/>
+      </w:pPr>
+      <w:r>
+        <w:rPr>
+          <w:rFonts w:ascii="Arial" w:cs="Arial" w:eastAsia="Arial" w:hAnsi="Arial"/>
+          <w:sz w:val="20"/>
+          <w:szCs w:val="20"/>
+        </w:rPr>
+        <w:t xml:space="preserve">Goal: people who need access can declare that themselves inside the app, and either of the two of you can approve them, instead of manually adding every person by hand.</w:t>
+      </w:r>
+    </w:p>
+    <w:p>
+      <w:pPr>
+        <w:spacing w:after="100"/>
+      </w:pPr>
+      <w:r>
+        <w:rPr>
+          <w:rFonts w:ascii="Arial" w:cs="Arial" w:eastAsia="Arial" w:hAnsi="Arial"/>
+          <w:sz w:val="20"/>
+          <w:szCs w:val="20"/>
+        </w:rPr>
+        <w:t xml:space="preserve">New table: AccessRequests (add this as a 4th tab in the same Google Sheet, same pattern as the other tables):</w:t>
       </w:r>
     </w:p>
     <w:p>
@@ -4432,7 +4906,7 @@
         <w:pStyle w:val="ListParagraph"/>
         <w:numPr>
           <w:ilvl w:val="0"/>
-          <w:numId w:val="4"/>
+          <w:numId w:val="2"/>
         </w:numPr>
         <w:spacing w:after="100"/>
       </w:pPr>
@@ -4442,7 +4916,15 @@
           <w:sz w:val="20"/>
           <w:szCs w:val="20"/>
         </w:rPr>
-        <w:t xml:space="preserve">Preferred Option must be a plain Text column with a dynamic Suggested Values formula, not a true Ref column — AppSheet Ref columns can’t conditionally point at two different tables (RecommendedTrains vs RecommendedFlights) depending on another column’s value.</w:t>
+        <w:t xml:space="preserve">Request ID — Text, Key — Initial Value: </w:t>
+      </w:r>
+      <w:r>
+        <w:rPr>
+          <w:rFonts w:ascii="Consolas" w:cs="Consolas" w:eastAsia="Consolas" w:hAnsi="Consolas"/>
+          <w:sz w:val="19"/>
+          <w:szCs w:val="19"/>
+        </w:rPr>
+        <w:t xml:space="preserve">=UNIQUEID()</w:t>
       </w:r>
     </w:p>
     <w:p>
@@ -4450,7 +4932,7 @@
         <w:pStyle w:val="ListParagraph"/>
         <w:numPr>
           <w:ilvl w:val="0"/>
-          <w:numId w:val="4"/>
+          <w:numId w:val="2"/>
         </w:numPr>
         <w:spacing w:after="100"/>
       </w:pPr>
@@ -4460,7 +4942,15 @@
           <w:sz w:val="20"/>
           <w:szCs w:val="20"/>
         </w:rPr>
-        <w:t xml:space="preserve">The Traveller ID Upload flow requires Google sign-in for every user by default — there’s no unauthenticated link-only access without making the entire app public.</w:t>
+        <w:t xml:space="preserve">Timestamp — DateTime — Initial Value: </w:t>
+      </w:r>
+      <w:r>
+        <w:rPr>
+          <w:rFonts w:ascii="Consolas" w:cs="Consolas" w:eastAsia="Consolas" w:hAnsi="Consolas"/>
+          <w:sz w:val="19"/>
+          <w:szCs w:val="19"/>
+        </w:rPr>
+        <w:t xml:space="preserve">=NOW()</w:t>
       </w:r>
     </w:p>
     <w:p>
@@ -4468,7 +4958,7 @@
         <w:pStyle w:val="ListParagraph"/>
         <w:numPr>
           <w:ilvl w:val="0"/>
-          <w:numId w:val="4"/>
+          <w:numId w:val="2"/>
         </w:numPr>
         <w:spacing w:after="100"/>
       </w:pPr>
@@ -4478,7 +4968,39 @@
           <w:sz w:val="20"/>
           <w:szCs w:val="20"/>
         </w:rPr>
-        <w:t xml:space="preserve">The POC "bulk table" experience is a grid/Table view of separately-added rows, not a single form with an embedded multi-row table.</w:t>
+        <w:t xml:space="preserve">Requester Email — Email — Initial Value: </w:t>
+      </w:r>
+      <w:r>
+        <w:rPr>
+          <w:rFonts w:ascii="Consolas" w:cs="Consolas" w:eastAsia="Consolas" w:hAnsi="Consolas"/>
+          <w:sz w:val="19"/>
+          <w:szCs w:val="19"/>
+        </w:rPr>
+        <w:t xml:space="preserve">=USEREMAIL()</w:t>
+      </w:r>
+      <w:r>
+        <w:rPr>
+          <w:rFonts w:ascii="Arial" w:cs="Arial" w:eastAsia="Arial" w:hAnsi="Arial"/>
+          <w:sz w:val="20"/>
+          <w:szCs w:val="20"/>
+        </w:rPr>
+        <w:t xml:space="preserve"> — Editable_If: </w:t>
+      </w:r>
+      <w:r>
+        <w:rPr>
+          <w:rFonts w:ascii="Consolas" w:cs="Consolas" w:eastAsia="Consolas" w:hAnsi="Consolas"/>
+          <w:sz w:val="19"/>
+          <w:szCs w:val="19"/>
+        </w:rPr>
+        <w:t xml:space="preserve">=FALSE</w:t>
+      </w:r>
+      <w:r>
+        <w:rPr>
+          <w:rFonts w:ascii="Arial" w:cs="Arial" w:eastAsia="Arial" w:hAnsi="Arial"/>
+          <w:sz w:val="20"/>
+          <w:szCs w:val="20"/>
+        </w:rPr>
+        <w:t xml:space="preserve"> (locks it to whoever is actually signed in, so nobody can request access on someone else's behalf)</w:t>
       </w:r>
     </w:p>
     <w:p>
@@ -4486,7 +5008,489 @@
         <w:pStyle w:val="ListParagraph"/>
         <w:numPr>
           <w:ilvl w:val="0"/>
-          <w:numId w:val="4"/>
+          <w:numId w:val="2"/>
+        </w:numPr>
+        <w:spacing w:after="100"/>
+      </w:pPr>
+      <w:r>
+        <w:rPr>
+          <w:rFonts w:ascii="Arial" w:cs="Arial" w:eastAsia="Arial" w:hAnsi="Arial"/>
+          <w:sz w:val="20"/>
+          <w:szCs w:val="20"/>
+        </w:rPr>
+        <w:t xml:space="preserve">Requester Name — Text — Required: Yes</w:t>
+      </w:r>
+    </w:p>
+    <w:p>
+      <w:pPr>
+        <w:pStyle w:val="ListParagraph"/>
+        <w:numPr>
+          <w:ilvl w:val="0"/>
+          <w:numId w:val="2"/>
+        </w:numPr>
+        <w:spacing w:after="100"/>
+      </w:pPr>
+      <w:r>
+        <w:rPr>
+          <w:rFonts w:ascii="Arial" w:cs="Arial" w:eastAsia="Arial" w:hAnsi="Arial"/>
+          <w:sz w:val="20"/>
+          <w:szCs w:val="20"/>
+        </w:rPr>
+        <w:t xml:space="preserve">Requested Role — Enum (Requester, Coordinator, Accommodation desk, Travel desk)</w:t>
+      </w:r>
+    </w:p>
+    <w:p>
+      <w:pPr>
+        <w:pStyle w:val="ListParagraph"/>
+        <w:numPr>
+          <w:ilvl w:val="0"/>
+          <w:numId w:val="2"/>
+        </w:numPr>
+        <w:spacing w:after="100"/>
+      </w:pPr>
+      <w:r>
+        <w:rPr>
+          <w:rFonts w:ascii="Arial" w:cs="Arial" w:eastAsia="Arial" w:hAnsi="Arial"/>
+          <w:sz w:val="20"/>
+          <w:szCs w:val="20"/>
+        </w:rPr>
+        <w:t xml:space="preserve">Status — Enum (Requested, Approved, Denied) — Initial Value: </w:t>
+      </w:r>
+      <w:r>
+        <w:rPr>
+          <w:rFonts w:ascii="Consolas" w:cs="Consolas" w:eastAsia="Consolas" w:hAnsi="Consolas"/>
+          <w:sz w:val="19"/>
+          <w:szCs w:val="19"/>
+        </w:rPr>
+        <w:t xml:space="preserve">"Requested"</w:t>
+      </w:r>
+      <w:r>
+        <w:rPr>
+          <w:rFonts w:ascii="Arial" w:cs="Arial" w:eastAsia="Arial" w:hAnsi="Arial"/>
+          <w:sz w:val="20"/>
+          <w:szCs w:val="20"/>
+        </w:rPr>
+        <w:t xml:space="preserve"> — Editable_If: </w:t>
+      </w:r>
+      <w:r>
+        <w:rPr>
+          <w:rFonts w:ascii="Consolas" w:cs="Consolas" w:eastAsia="Consolas" w:hAnsi="Consolas"/>
+          <w:sz w:val="19"/>
+          <w:szCs w:val="19"/>
+        </w:rPr>
+        <w:t xml:space="preserve">=FALSE</w:t>
+      </w:r>
+      <w:r>
+        <w:rPr>
+          <w:rFonts w:ascii="Arial" w:cs="Arial" w:eastAsia="Arial" w:hAnsi="Arial"/>
+          <w:sz w:val="20"/>
+          <w:szCs w:val="20"/>
+        </w:rPr>
+        <w:t xml:space="preserve"> (only ever changed via the Approve/Deny actions below, never hand-typed)</w:t>
+      </w:r>
+    </w:p>
+    <w:p>
+      <w:pPr>
+        <w:pStyle w:val="ListParagraph"/>
+        <w:numPr>
+          <w:ilvl w:val="0"/>
+          <w:numId w:val="2"/>
+        </w:numPr>
+        <w:spacing w:after="100"/>
+      </w:pPr>
+      <w:r>
+        <w:rPr>
+          <w:rFonts w:ascii="Arial" w:cs="Arial" w:eastAsia="Arial" w:hAnsi="Arial"/>
+          <w:sz w:val="20"/>
+          <w:szCs w:val="20"/>
+        </w:rPr>
+        <w:t xml:space="preserve">Reviewed By — Email — left blank until reviewed</w:t>
+      </w:r>
+    </w:p>
+    <w:p>
+      <w:pPr>
+        <w:pStyle w:val="ListParagraph"/>
+        <w:numPr>
+          <w:ilvl w:val="0"/>
+          <w:numId w:val="2"/>
+        </w:numPr>
+        <w:spacing w:after="100"/>
+      </w:pPr>
+      <w:r>
+        <w:rPr>
+          <w:rFonts w:ascii="Arial" w:cs="Arial" w:eastAsia="Arial" w:hAnsi="Arial"/>
+          <w:sz w:val="20"/>
+          <w:szCs w:val="20"/>
+        </w:rPr>
+        <w:t xml:space="preserve">Reviewed At — DateTime — left blank until reviewed</w:t>
+      </w:r>
+    </w:p>
+    <w:p>
+      <w:pPr>
+        <w:spacing w:after="100" w:before="160"/>
+      </w:pPr>
+      <w:r>
+        <w:rPr>
+          <w:rFonts w:ascii="Arial" w:cs="Arial" w:eastAsia="Arial" w:hAnsi="Arial"/>
+          <w:sz w:val="20"/>
+          <w:szCs w:val="20"/>
+        </w:rPr>
+        <w:t xml:space="preserve">Two new views:</w:t>
+      </w:r>
+    </w:p>
+    <w:p>
+      <w:pPr>
+        <w:pStyle w:val="ListParagraph"/>
+        <w:numPr>
+          <w:ilvl w:val="0"/>
+          <w:numId w:val="2"/>
+        </w:numPr>
+        <w:spacing w:after="100"/>
+      </w:pPr>
+      <w:r>
+        <w:rPr>
+          <w:rFonts w:ascii="Arial" w:cs="Arial" w:eastAsia="Arial" w:hAnsi="Arial"/>
+          <w:sz w:val="20"/>
+          <w:szCs w:val="20"/>
+        </w:rPr>
+        <w:t xml:space="preserve">**Request Access** — Form view, table AccessRequests, Add-only, visible to anyone signed in. Since AppSheet already requires Google sign-in to open the app at all, "self-declare" here means: any signed-in person fills this form with their name and the role/access they're asking for.</w:t>
+      </w:r>
+    </w:p>
+    <w:p>
+      <w:pPr>
+        <w:pStyle w:val="ListParagraph"/>
+        <w:numPr>
+          <w:ilvl w:val="0"/>
+          <w:numId w:val="2"/>
+        </w:numPr>
+        <w:spacing w:after="100"/>
+      </w:pPr>
+      <w:r>
+        <w:rPr>
+          <w:rFonts w:ascii="Arial" w:cs="Arial" w:eastAsia="Arial" w:hAnsi="Arial"/>
+          <w:sz w:val="20"/>
+          <w:szCs w:val="20"/>
+        </w:rPr>
+        <w:t xml:space="preserve">**Access Requests (Admin)** — Table or Deck view, table AccessRequests, row filter </w:t>
+      </w:r>
+      <w:r>
+        <w:rPr>
+          <w:rFonts w:ascii="Consolas" w:cs="Consolas" w:eastAsia="Consolas" w:hAnsi="Consolas"/>
+          <w:sz w:val="19"/>
+          <w:szCs w:val="19"/>
+        </w:rPr>
+        <w:t xml:space="preserve">=[Status]="Requested"</w:t>
+      </w:r>
+      <w:r>
+        <w:rPr>
+          <w:rFonts w:ascii="Arial" w:cs="Arial" w:eastAsia="Arial" w:hAnsi="Arial"/>
+          <w:sz w:val="20"/>
+          <w:szCs w:val="20"/>
+        </w:rPr>
+        <w:t xml:space="preserve">, and the view itself restricted with Show_If: </w:t>
+      </w:r>
+      <w:r>
+        <w:rPr>
+          <w:rFonts w:ascii="Consolas" w:cs="Consolas" w:eastAsia="Consolas" w:hAnsi="Consolas"/>
+          <w:sz w:val="19"/>
+          <w:szCs w:val="19"/>
+        </w:rPr>
+        <w:t xml:space="preserve">=IN(USEREMAIL(), LIST("&lt;first-admin-email&gt;", "&lt;second-admin-email&gt;"))</w:t>
+      </w:r>
+      <w:r>
+        <w:rPr>
+          <w:rFonts w:ascii="Arial" w:cs="Arial" w:eastAsia="Arial" w:hAnsi="Arial"/>
+          <w:sz w:val="20"/>
+          <w:szCs w:val="20"/>
+        </w:rPr>
+        <w:t xml:space="preserve"> — replace the two placeholders with your two actual email addresses. This is literally the "either you or me" from the requirements: only those two signed-in emails can see or act on this view.</w:t>
+      </w:r>
+    </w:p>
+    <w:p>
+      <w:pPr>
+        <w:spacing w:after="100" w:before="140"/>
+      </w:pPr>
+      <w:r>
+        <w:rPr>
+          <w:rFonts w:ascii="Arial" w:cs="Arial" w:eastAsia="Arial" w:hAnsi="Arial"/>
+          <w:sz w:val="20"/>
+          <w:szCs w:val="20"/>
+        </w:rPr>
+        <w:t xml:space="preserve">Two new actions, both on AccessRequests, both restricted with the same Show_If as the Admin view above:</w:t>
+      </w:r>
+    </w:p>
+    <w:p>
+      <w:pPr>
+        <w:pStyle w:val="ListParagraph"/>
+        <w:numPr>
+          <w:ilvl w:val="0"/>
+          <w:numId w:val="2"/>
+        </w:numPr>
+        <w:spacing w:after="100"/>
+      </w:pPr>
+      <w:r>
+        <w:rPr>
+          <w:rFonts w:ascii="Arial" w:cs="Arial" w:eastAsia="Arial" w:hAnsi="Arial"/>
+          <w:sz w:val="20"/>
+          <w:szCs w:val="20"/>
+        </w:rPr>
+        <w:t xml:space="preserve">**Approve** — sets </w:t>
+      </w:r>
+      <w:r>
+        <w:rPr>
+          <w:rFonts w:ascii="Consolas" w:cs="Consolas" w:eastAsia="Consolas" w:hAnsi="Consolas"/>
+          <w:sz w:val="19"/>
+          <w:szCs w:val="19"/>
+        </w:rPr>
+        <w:t xml:space="preserve">[Status]</w:t>
+      </w:r>
+      <w:r>
+        <w:rPr>
+          <w:rFonts w:ascii="Arial" w:cs="Arial" w:eastAsia="Arial" w:hAnsi="Arial"/>
+          <w:sz w:val="20"/>
+          <w:szCs w:val="20"/>
+        </w:rPr>
+        <w:t xml:space="preserve"> to </w:t>
+      </w:r>
+      <w:r>
+        <w:rPr>
+          <w:rFonts w:ascii="Consolas" w:cs="Consolas" w:eastAsia="Consolas" w:hAnsi="Consolas"/>
+          <w:sz w:val="19"/>
+          <w:szCs w:val="19"/>
+        </w:rPr>
+        <w:t xml:space="preserve">"Approved"</w:t>
+      </w:r>
+      <w:r>
+        <w:rPr>
+          <w:rFonts w:ascii="Arial" w:cs="Arial" w:eastAsia="Arial" w:hAnsi="Arial"/>
+          <w:sz w:val="20"/>
+          <w:szCs w:val="20"/>
+        </w:rPr>
+        <w:t xml:space="preserve">, </w:t>
+      </w:r>
+      <w:r>
+        <w:rPr>
+          <w:rFonts w:ascii="Consolas" w:cs="Consolas" w:eastAsia="Consolas" w:hAnsi="Consolas"/>
+          <w:sz w:val="19"/>
+          <w:szCs w:val="19"/>
+        </w:rPr>
+        <w:t xml:space="preserve">[Reviewed By]</w:t>
+      </w:r>
+      <w:r>
+        <w:rPr>
+          <w:rFonts w:ascii="Arial" w:cs="Arial" w:eastAsia="Arial" w:hAnsi="Arial"/>
+          <w:sz w:val="20"/>
+          <w:szCs w:val="20"/>
+        </w:rPr>
+        <w:t xml:space="preserve"> to </w:t>
+      </w:r>
+      <w:r>
+        <w:rPr>
+          <w:rFonts w:ascii="Consolas" w:cs="Consolas" w:eastAsia="Consolas" w:hAnsi="Consolas"/>
+          <w:sz w:val="19"/>
+          <w:szCs w:val="19"/>
+        </w:rPr>
+        <w:t xml:space="preserve">=USEREMAIL()</w:t>
+      </w:r>
+      <w:r>
+        <w:rPr>
+          <w:rFonts w:ascii="Arial" w:cs="Arial" w:eastAsia="Arial" w:hAnsi="Arial"/>
+          <w:sz w:val="20"/>
+          <w:szCs w:val="20"/>
+        </w:rPr>
+        <w:t xml:space="preserve">, </w:t>
+      </w:r>
+      <w:r>
+        <w:rPr>
+          <w:rFonts w:ascii="Consolas" w:cs="Consolas" w:eastAsia="Consolas" w:hAnsi="Consolas"/>
+          <w:sz w:val="19"/>
+          <w:szCs w:val="19"/>
+        </w:rPr>
+        <w:t xml:space="preserve">[Reviewed At]</w:t>
+      </w:r>
+      <w:r>
+        <w:rPr>
+          <w:rFonts w:ascii="Arial" w:cs="Arial" w:eastAsia="Arial" w:hAnsi="Arial"/>
+          <w:sz w:val="20"/>
+          <w:szCs w:val="20"/>
+        </w:rPr>
+        <w:t xml:space="preserve"> to </w:t>
+      </w:r>
+      <w:r>
+        <w:rPr>
+          <w:rFonts w:ascii="Consolas" w:cs="Consolas" w:eastAsia="Consolas" w:hAnsi="Consolas"/>
+          <w:sz w:val="19"/>
+          <w:szCs w:val="19"/>
+        </w:rPr>
+        <w:t xml:space="preserve">=NOW()</w:t>
+      </w:r>
+      <w:r>
+        <w:rPr>
+          <w:rFonts w:ascii="Arial" w:cs="Arial" w:eastAsia="Arial" w:hAnsi="Arial"/>
+          <w:sz w:val="20"/>
+          <w:szCs w:val="20"/>
+        </w:rPr>
+        <w:t xml:space="preserve">.</w:t>
+      </w:r>
+    </w:p>
+    <w:p>
+      <w:pPr>
+        <w:pStyle w:val="ListParagraph"/>
+        <w:numPr>
+          <w:ilvl w:val="0"/>
+          <w:numId w:val="2"/>
+        </w:numPr>
+        <w:spacing w:after="100"/>
+      </w:pPr>
+      <w:r>
+        <w:rPr>
+          <w:rFonts w:ascii="Arial" w:cs="Arial" w:eastAsia="Arial" w:hAnsi="Arial"/>
+          <w:sz w:val="20"/>
+          <w:szCs w:val="20"/>
+        </w:rPr>
+        <w:t xml:space="preserve">**Deny** — same pattern, sets </w:t>
+      </w:r>
+      <w:r>
+        <w:rPr>
+          <w:rFonts w:ascii="Consolas" w:cs="Consolas" w:eastAsia="Consolas" w:hAnsi="Consolas"/>
+          <w:sz w:val="19"/>
+          <w:szCs w:val="19"/>
+        </w:rPr>
+        <w:t xml:space="preserve">[Status]</w:t>
+      </w:r>
+      <w:r>
+        <w:rPr>
+          <w:rFonts w:ascii="Arial" w:cs="Arial" w:eastAsia="Arial" w:hAnsi="Arial"/>
+          <w:sz w:val="20"/>
+          <w:szCs w:val="20"/>
+        </w:rPr>
+        <w:t xml:space="preserve"> to </w:t>
+      </w:r>
+      <w:r>
+        <w:rPr>
+          <w:rFonts w:ascii="Consolas" w:cs="Consolas" w:eastAsia="Consolas" w:hAnsi="Consolas"/>
+          <w:sz w:val="19"/>
+          <w:szCs w:val="19"/>
+        </w:rPr>
+        <w:t xml:space="preserve">"Denied"</w:t>
+      </w:r>
+      <w:r>
+        <w:rPr>
+          <w:rFonts w:ascii="Arial" w:cs="Arial" w:eastAsia="Arial" w:hAnsi="Arial"/>
+          <w:sz w:val="20"/>
+          <w:szCs w:val="20"/>
+        </w:rPr>
+        <w:t xml:space="preserve">.</w:t>
+      </w:r>
+    </w:p>
+    <w:p>
+      <w:pPr>
+        <w:pBdr>
+          <w:top w:val="single" w:color="4A2A15" w:sz="4"/>
+          <w:left w:val="single" w:color="4A2A15" w:sz="4"/>
+          <w:bottom w:val="single" w:color="4A2A15" w:sz="4"/>
+          <w:right w:val="single" w:color="4A2A15" w:sz="4"/>
+        </w:pBdr>
+        <w:shd w:fill="F3ECE2" w:val="clear"/>
+        <w:spacing w:after="200" w:before="120"/>
+        <w:ind w:left="100" w:right="100"/>
+      </w:pPr>
+      <w:r>
+        <w:rPr>
+          <w:rFonts w:ascii="Arial" w:cs="Arial" w:eastAsia="Arial" w:hAnsi="Arial"/>
+          <w:sz w:val="20"/>
+          <w:szCs w:val="20"/>
+        </w:rPr>
+        <w:t xml:space="preserve">IMPORTANT — approving a row here does NOT, by itself, let that person open the AppSheet app. AppSheet's actual access control is separate: either the app is already set to "Anyone in [your Google Workspace domain] with the link" (Manage → Users in the editor), in which case this flow is really about granting VISIBILITY into specific desk views/data — enforced with a Security Filter that checks a signed-in user's email against Approved rows in AccessRequests — or the app is restricted to individually-invited users, in which case this flow becomes a request queue only, and the admin still has to manually add the approved person's email under Manage → Users after approving here. There is no formula that can invite someone to the app itself. Decide which of these two matches your app's current access setting before building this section, since it changes what "Approve" actually accomplishes.</w:t>
+      </w:r>
+    </w:p>
+    <w:p>
+      <w:pPr>
+        <w:pStyle w:val="ListParagraph"/>
+        <w:numPr>
+          <w:ilvl w:val="0"/>
+          <w:numId w:val="2"/>
+        </w:numPr>
+        <w:spacing w:after="100"/>
+      </w:pPr>
+      <w:r>
+        <w:rPr>
+          <w:rFonts w:ascii="Arial" w:cs="Arial" w:eastAsia="Arial" w:hAnsi="Arial"/>
+          <w:sz w:val="20"/>
+          <w:szCs w:val="20"/>
+        </w:rPr>
+        <w:t xml:space="preserve">Optional: add a Bot that emails the two admins when a new row is added to AccessRequests, so approvals don't rely on someone remembering to check the Admin view.</w:t>
+      </w:r>
+    </w:p>
+    <w:p>
+      <w:pPr>
+        <w:pStyle w:val="Heading1"/>
+        <w:spacing w:after="160" w:before="320"/>
+      </w:pPr>
+      <w:r>
+        <w:t xml:space="preserve">Deviations from the original blueprint / prototype — read before you start</w:t>
+      </w:r>
+    </w:p>
+    <w:p>
+      <w:pPr>
+        <w:pStyle w:val="ListParagraph"/>
+        <w:numPr>
+          <w:ilvl w:val="0"/>
+          <w:numId w:val="5"/>
+        </w:numPr>
+        <w:spacing w:after="100"/>
+      </w:pPr>
+      <w:r>
+        <w:rPr>
+          <w:rFonts w:ascii="Arial" w:cs="Arial" w:eastAsia="Arial" w:hAnsi="Arial"/>
+          <w:sz w:val="20"/>
+          <w:szCs w:val="20"/>
+        </w:rPr>
+        <w:t xml:space="preserve">Preferred Option must be a plain Text column with a dynamic Suggested Values formula, not a true Ref column — AppSheet Ref columns can’t conditionally point at two different tables (RecommendedTrains vs RecommendedFlights) depending on another column’s value.</w:t>
+      </w:r>
+    </w:p>
+    <w:p>
+      <w:pPr>
+        <w:pStyle w:val="ListParagraph"/>
+        <w:numPr>
+          <w:ilvl w:val="0"/>
+          <w:numId w:val="5"/>
+        </w:numPr>
+        <w:spacing w:after="100"/>
+      </w:pPr>
+      <w:r>
+        <w:rPr>
+          <w:rFonts w:ascii="Arial" w:cs="Arial" w:eastAsia="Arial" w:hAnsi="Arial"/>
+          <w:sz w:val="20"/>
+          <w:szCs w:val="20"/>
+        </w:rPr>
+        <w:t xml:space="preserve">The Traveller ID Upload flow requires Google sign-in for every user by default — there’s no unauthenticated link-only access without making the entire app public.</w:t>
+      </w:r>
+    </w:p>
+    <w:p>
+      <w:pPr>
+        <w:pStyle w:val="ListParagraph"/>
+        <w:numPr>
+          <w:ilvl w:val="0"/>
+          <w:numId w:val="5"/>
+        </w:numPr>
+        <w:spacing w:after="100"/>
+      </w:pPr>
+      <w:r>
+        <w:rPr>
+          <w:rFonts w:ascii="Arial" w:cs="Arial" w:eastAsia="Arial" w:hAnsi="Arial"/>
+          <w:sz w:val="20"/>
+          <w:szCs w:val="20"/>
+        </w:rPr>
+        <w:t xml:space="preserve">The POC "bulk table" experience is a grid/Table view of separately-added rows, not a single form with an embedded multi-row table.</w:t>
+      </w:r>
+    </w:p>
+    <w:p>
+      <w:pPr>
+        <w:pStyle w:val="ListParagraph"/>
+        <w:numPr>
+          <w:ilvl w:val="0"/>
+          <w:numId w:val="5"/>
         </w:numPr>
         <w:spacing w:after="100"/>
       </w:pPr>
@@ -4698,6 +5702,18 @@
     </w:lvl>
   </w:abstractNum>
   <w:abstractNum w:abstractNumId="4" w15:restartNumberingAfterBreak="0">
+    <w:multiLevelType w:val="hybridMultilevel"/>
+    <w:lvl w:ilvl="0" w15:tentative="1">
+      <w:start w:val="1"/>
+      <w:numFmt w:val="decimal"/>
+      <w:lvlText w:val="%1."/>
+      <w:lvlJc w:val="left"/>
+      <w:pPr>
+        <w:ind w:left="360" w:hanging="260"/>
+      </w:pPr>
+    </w:lvl>
+  </w:abstractNum>
+  <w:abstractNum w:abstractNumId="5" w15:restartNumberingAfterBreak="0">
     <w:multiLevelType w:val="hybridMultilevel"/>
     <w:lvl w:ilvl="0" w15:tentative="1">
       <w:start w:val="1"/>
@@ -4728,6 +5744,12 @@
     </w:lvlOverride>
   </w:num>
   <w:num w:numId="4">
+    <w:abstractNumId w:val="5"/>
+    <w:lvlOverride w:ilvl="0">
+      <w:startOverride w:val="1"/>
+    </w:lvlOverride>
+  </w:num>
+  <w:num w:numId="5">
     <w:abstractNumId w:val="4"/>
     <w:lvlOverride w:ilvl="0">
       <w:startOverride w:val="1"/>

</xml_diff>